<commit_message>
docs: add correct branch name to clone instructions
Updated README.md and DEPLOYMENT.md to include
git checkout claude/ai-prototype-challenge-oTxa2 after cloning.
Regenerated Word documents to match.

https://claude.ai/code/session_01LLVABjHDAB7qE7ZKbFLnAe
</commit_message>
<xml_diff>
--- a/docs/ClaimClear_AI_Deployment_Guide.docx
+++ b/docs/ClaimClear_AI_Deployment_Guide.docx
@@ -293,11 +293,13 @@
           <w:color w:val="2D2D2D"/>
           <w:sz w:val="18"/>
         </w:rPr>
-        <w:t># 1. Clone the repository</w:t>
+        <w:t># 1. Clone the repository and switch to the correct branch</w:t>
         <w:br/>
         <w:t>git clone https://github.com/annondeveloper/hackathon.git</w:t>
         <w:br/>
         <w:t>cd hackathon</w:t>
+        <w:br/>
+        <w:t>git checkout claude/ai-prototype-challenge-oTxa2</w:t>
         <w:br/>
         <w:br/>
         <w:t># 2. Create and activate a virtual environment</w:t>

</xml_diff>